<commit_message>
Fix mistake in diagram
</commit_message>
<xml_diff>
--- a/doc/report.docx
+++ b/doc/report.docx
@@ -31,7 +31,7 @@
         <w:pStyle w:val="Date"/>
       </w:pPr>
       <w:r>
-        <w:t xml:space="preserve">2026-08-27</w:t>
+        <w:t xml:space="preserve">2026-09-30</w:t>
       </w:r>
     </w:p>
     <w:sdt>
@@ -7274,6 +7274,38 @@
         <w:t xml:space="preserve">I ran everything for both types of models, so the choice of primary model can be changed without redoing the analysis.</w:t>
       </w:r>
     </w:p>
+    <w:p>
+      <w:pPr>
+        <w:pStyle w:val="Compact"/>
+        <w:numPr>
+          <w:ilvl w:val="0"/>
+          <w:numId w:val="1008"/>
+        </w:numPr>
+      </w:pPr>
+      <w:r>
+        <w:t xml:space="preserve">Estimates are reported as β (standardised), but every p-value and significance star comes from the test of the unstandardised coefficient (b).</w:t>
+      </w:r>
+      <w:r>
+        <w:t xml:space="preserve"> </w:t>
+      </w:r>
+      <w:r>
+        <w:t xml:space="preserve">The two tests are not identical, and for a borderline path they can land on opposite sides of .05 (see the video game autoregression in</w:t>
+      </w:r>
+      <w:r>
+        <w:t xml:space="preserve"> </w:t>
+      </w:r>
+      <w:hyperlink w:anchor="tbl-riclpm">
+        <w:r>
+          <w:rPr>
+            <w:rStyle w:val="Hyperlink"/>
+          </w:rPr>
+          <w:t xml:space="preserve">Table 11</w:t>
+        </w:r>
+      </w:hyperlink>
+      <w:r>
+        <w:t xml:space="preserve">), so I’ve used the one for the actual model parameter throughout.</w:t>
+      </w:r>
+    </w:p>
     <w:bookmarkEnd w:id="42"/>
     <w:bookmarkStart w:id="43" w:name="sec-within-between"/>
     <w:p>
@@ -8858,7 +8890,7 @@
               <w:pStyle w:val="ImageCaption"/>
             </w:pPr>
             <w:r>
-              <w:t xml:space="preserve">Table 10: Cross-lagged paths estimated separately at each lag, with a Wald test of whether they differ, from the freely estimated RI-CLPM.</w:t>
+              <w:t xml:space="preserve">Table 10: Cross-lagged paths estimated separately at each lag, with a Wald test of whether they differ, from the freely estimated RI-CLPM. β with 95% CI; p tests the unstandardised estimate.</w:t>
             </w:r>
           </w:p>
           <w:tbl>
@@ -8982,7 +9014,7 @@
                     <w:jc w:val="center"/>
                   </w:pPr>
                   <w:r>
-                    <w:t xml:space="preserve">.101 [-.002, .203], p = .054</w:t>
+                    <w:t xml:space="preserve">.101 [-.002, .203], p = .064</w:t>
                   </w:r>
                 </w:p>
               </w:tc>
@@ -10683,7 +10715,21 @@
               <w:pStyle w:val="ImageCaption"/>
             </w:pPr>
             <w:r>
-              <w:t xml:space="preserve">Figure 1: RI-CLPM with standardised estimates. Squares are observed variables, ellipses are latent: the random intercepts capture stable between-child differences, and the within-person components (VG, SDQ) capture each child’s deviation from their own average. Blue arrows are the estimated structural paths; grey dashed arrows are fixed at 1. * p &lt; .05, ** p &lt; .01, *** p &lt; .001.</w:t>
+              <w:t xml:space="preserve">Figure 1: RI-CLPM with standardised estimates. Squares are observed variables, ellipses are latent: the random intercepts capture stable between-child differences, and the within-person components (VG, SDQ) capture each child’s deviation from their own average. Blue arrows are the estimated structural paths; grey dashed arrows are fixed at 1. Stars test the unstandardised estimates in</w:t>
+            </w:r>
+            <w:r>
+              <w:t xml:space="preserve"> </w:t>
+            </w:r>
+            <w:hyperlink w:anchor="tbl-riclpm">
+              <w:r>
+                <w:rPr>
+                  <w:rStyle w:val="Hyperlink"/>
+                </w:rPr>
+                <w:t xml:space="preserve">Table 11</w:t>
+              </w:r>
+            </w:hyperlink>
+            <w:r>
+              <w:t xml:space="preserve">: * p &lt; .05, ** p &lt; .01, *** p &lt; .001.</w:t>
             </w:r>
           </w:p>
           <w:bookmarkEnd w:id="58"/>
@@ -10854,7 +10900,7 @@
               <w:t xml:space="preserve"> </w:t>
             </w:r>
             <w:r>
-              <w:t xml:space="preserve">That pooled estimate averages a marginal positive effect from 10/11 to 12/13 (β = .101, p = .054) and a null from 12/13 to 14/15 (β = −.007, p = .785), and those two just barelydiffer from each other (p = .049).</w:t>
+              <w:t xml:space="preserve">That pooled estimate averages a marginal positive effect from 10/11 to 12/13 (β = .101, p = .064) and a null from 12/13 to 14/15 (β = −.007, p = .785), and those two just barelydiffer from each other (p = .049).</w:t>
             </w:r>
             <w:r>
               <w:t xml:space="preserve"> </w:t>
@@ -10905,7 +10951,7 @@
               <w:t xml:space="preserve"> </w:t>
             </w:r>
             <w:r>
-              <w:t xml:space="preserve">The first-lag effect is only p = .054 even when estimated freely, so the effect would not have been significant if estimated freely.</w:t>
+              <w:t xml:space="preserve">The first-lag effect is only p = .064 even when estimated freely, so the effect would not have been significant if estimated freely.</w:t>
             </w:r>
           </w:p>
           <w:p>
@@ -10947,7 +10993,7 @@
               </w:numPr>
             </w:pPr>
             <w:r>
-              <w:t xml:space="preserve">One thing I did find hard to explain: the within-person video game autoregression is −.26 at the first lag and +.28 at the second.</w:t>
+              <w:t xml:space="preserve">One thing I did find hard to explain: the within-person video game autoregression is −.26 at the first lag (not significant, p = .068) and +.28 at the second.</w:t>
             </w:r>
             <w:r>
               <w:t xml:space="preserve"> </w:t>
@@ -12771,7 +12817,21 @@
               <w:pStyle w:val="ImageCaption"/>
             </w:pPr>
             <w:r>
-              <w:t xml:space="preserve">Figure 2: Traditional CLPM with standardised estimates. All variables are observed (squares); with no random intercepts, the lagged paths run directly between them and mix between-child and within-child variation. Sex and socioeconomic position are included as covariates but their paths are omitted for legibility. * p &lt; .05, ** p &lt; .01, *** p &lt; .001.</w:t>
+              <w:t xml:space="preserve">Figure 2: Traditional CLPM with standardised estimates. All variables are observed (squares); with no random intercepts, the lagged paths run directly between them and mix between-child and within-child variation. Sex and socioeconomic position are included as covariates but their paths are omitted for legibility. Stars test the unstandardised estimates in</w:t>
+            </w:r>
+            <w:r>
+              <w:t xml:space="preserve"> </w:t>
+            </w:r>
+            <w:hyperlink w:anchor="tbl-clpm">
+              <w:r>
+                <w:rPr>
+                  <w:rStyle w:val="Hyperlink"/>
+                </w:rPr>
+                <w:t xml:space="preserve">Table 13</w:t>
+              </w:r>
+            </w:hyperlink>
+            <w:r>
+              <w:t xml:space="preserve">: * p &lt; .05, ** p &lt; .01, *** p &lt; .001.</w:t>
             </w:r>
           </w:p>
           <w:bookmarkEnd w:id="70"/>
@@ -22142,7 +22202,7 @@
               <w:pStyle w:val="ImageCaption"/>
             </w:pPr>
             <w:r>
-              <w:t xml:space="preserve">Table 18: Cross-lagged paths across the sensitivity analyses. β with 95% CI; * p &lt; .05, ** p &lt; .01, *** p &lt; .001.</w:t>
+              <w:t xml:space="preserve">Table 18: Cross-lagged paths across the sensitivity analyses. β with 95% CI; stars test the unstandardised estimate: * p &lt; .05, ** p &lt; .01, *** p &lt; .001.</w:t>
             </w:r>
             <w:r>
               <w:t xml:space="preserve"> </w:t>

</xml_diff>